<commit_message>
v3 deck: drop customer-discovery slide, add market size, redo business model
Adds a TAM/SAM/SOM slide after the regulation slide (offshore IRM
US$13.6B, offshore drone inspection services US$1.5B, 1% SOM target)
and redraws the business model as value and money flows between
partner, MLC and customer, with revenue streams, cost structure and
customer savings below. Page numbers, notes and the Word script follow.

Co-Authored-By: Claude Opus 5.5 <noreply@anthropic.com>
Claude-Session: https://claude.ai/code/session_01WJhUeJknrpz3z9hRfyX3tP
</commit_message>
<xml_diff>
--- a/MLC_IR_A-STREAM2026_v3_script.docx
+++ b/MLC_IR_A-STREAM2026_v3_script.docx
@@ -41,7 +41,7 @@
           <w:sz w:val="20"/>
           <w:szCs w:val="20"/>
         </w:rPr>
-        <w:t xml:space="preserve">2026. 10. 21 · 발표 시간 5분 · 슬라이드 11장 · 대본 합계 약 4분 55초</w:t>
+        <w:t xml:space="preserve">2026. 10. 21 · 발표 시간 5분 · 슬라이드 11장 · 대본 합계 약 4분 50초</w:t>
       </w:r>
     </w:p>
     <w:tbl>
@@ -432,7 +432,7 @@
                 <w:sz w:val="20"/>
                 <w:szCs w:val="20"/>
               </w:rPr>
-              <w:t xml:space="preserve">고객 인터뷰로 바뀐 가설</w:t>
+              <w:t xml:space="preserve">MLC 솔루션</w:t>
             </w:r>
           </w:p>
           <w:p>
@@ -446,7 +446,7 @@
                 <w:sz w:val="18"/>
                 <w:szCs w:val="18"/>
               </w:rPr>
-              <w:t xml:space="preserve">약 40초</w:t>
+              <w:t xml:space="preserve">약 32초</w:t>
             </w:r>
           </w:p>
         </w:tc>
@@ -470,7 +470,7 @@
                 <w:sz w:val="22"/>
                 <w:szCs w:val="22"/>
               </w:rPr>
-              <w:t xml:space="preserve">저희는 올해 7월 Tex-Corps 프로그램으로 미국에서 35명을 인터뷰했습니다. 처음 가설은 '검사원마다 판단이 달라 보정 도구가 필요하다'였는데, 현장 인력 11명 모두 아니라고 했습니다. 매뉴얼과 인증 시험으로 이미 해결된 문제였습니다. 대신 Williams의 한 관리자가 방향을 제시했습니다. 접근하기 어려운 곳을 드론으로 먼저 훑어서 정말 가까이 봐야 할 곳만 알려 주면 시간과 비용이 줄어든다는 것입니다. 이후 현장 인력 11명 중 10명이 여기에 공감했고, 의사결정권자 5명 모두 관심을 보이며 파일럿 조건까지 이야기했습니다.</w:t>
+              <w:t xml:space="preserve">MLC는 이렇게 작동합니다. 드론이나 카메라로 접근이 어려운 구간을 먼저 찍고, 녹이 있는 부분만 자동으로 골라낸 뒤, 그 녹의 색으로 위험도를 높음, 중간, 낮음으로 판정합니다. 마지막으로 구조물 사진 위에 위험한 지점부터 번호를 매긴 지도를 드립니다. 시편을 자르지 않고 사진 한 장으로 판정한다는 점, 그리고 규제 주기는 그대로 지키면서 사람과 배와 리프트를 위험한 곳에 먼저 보낼 수 있다는 점이 차별점입니다.</w:t>
             </w:r>
           </w:p>
         </w:tc>
@@ -515,7 +515,7 @@
                 <w:sz w:val="20"/>
                 <w:szCs w:val="20"/>
               </w:rPr>
-              <w:t xml:space="preserve">MLC 솔루션</w:t>
+              <w:t xml:space="preserve">색으로 추적하는 부식 속도</w:t>
             </w:r>
           </w:p>
           <w:p>
@@ -529,7 +529,7 @@
                 <w:sz w:val="18"/>
                 <w:szCs w:val="18"/>
               </w:rPr>
-              <w:t xml:space="preserve">약 32초</w:t>
+              <w:t xml:space="preserve">약 35초</w:t>
             </w:r>
           </w:p>
         </w:tc>
@@ -553,7 +553,7 @@
                 <w:sz w:val="22"/>
                 <w:szCs w:val="22"/>
               </w:rPr>
-              <w:t xml:space="preserve">MLC는 이렇게 작동합니다. 드론이나 카메라로 접근이 어려운 구간을 먼저 찍고, 녹이 있는 부분만 자동으로 골라낸 뒤, 그 녹의 색으로 위험도를 높음, 중간, 낮음으로 판정합니다. 마지막으로 구조물 사진 위에 위험한 지점부터 번호를 매긴 지도를 드립니다. 시편을 자르지 않고 사진 한 장으로 판정한다는 점, 그리고 규제 주기는 그대로 지키면서 사람과 배와 리프트를 위험한 곳에 먼저 보낼 수 있다는 점이 차별점입니다.</w:t>
+              <w:t xml:space="preserve">핵심 기술은 실험실에서 검증했습니다. 탄소강을 240시간 촉진부식 시키며 측정했습니다. 보시는 것처럼 표면의 녹 색이 변하면서 색 좌표 b* 값이 1.7에서 13.1로 커지고, 같은 기간 실제 부식 속도는 연 0.34mm에서 1.45mm로 약 4배 빨라졌습니다. 색과 부식 속도의 순위 상관계수는 0.88이고, 위험도 세 구간의 부식 속도는 서로 겹치지 않습니다. 이 색 변화는 부식을 빠르게 만드는 다공성 녹 성분이 늘어나면서 생기기 때문에, 색과 속도가 함께 움직이는 물리적 근거도 있습니다. 이 결과는 SEM, XRD, 전기화학 등 여섯 가지 분석으로 교차 검증했습니다.</w:t>
             </w:r>
           </w:p>
         </w:tc>
@@ -598,7 +598,7 @@
                 <w:sz w:val="20"/>
                 <w:szCs w:val="20"/>
               </w:rPr>
-              <w:t xml:space="preserve">색으로 추적하는 부식 속도</w:t>
+              <w:t xml:space="preserve">규제 기반 반복 수요</w:t>
             </w:r>
           </w:p>
           <w:p>
@@ -612,7 +612,7 @@
                 <w:sz w:val="18"/>
                 <w:szCs w:val="18"/>
               </w:rPr>
-              <w:t xml:space="preserve">약 35초</w:t>
+              <w:t xml:space="preserve">약 30초</w:t>
             </w:r>
           </w:p>
         </w:tc>
@@ -636,7 +636,7 @@
                 <w:sz w:val="22"/>
                 <w:szCs w:val="22"/>
               </w:rPr>
-              <w:t xml:space="preserve">핵심 기술은 실험실에서 검증했습니다. 탄소강을 240시간 촉진부식 시키며 측정했습니다. 보시는 것처럼 표면의 녹 색이 변하면서 색 좌표 b* 값이 1.7에서 13.1로 커지고, 같은 기간 실제 부식 속도는 연 0.34mm에서 1.45mm로 약 4배 빨라졌습니다. 색과 부식 속도의 순위 상관계수는 0.88이고, 위험도 세 구간의 부식 속도는 서로 겹치지 않습니다. 이 색 변화는 부식을 빠르게 만드는 다공성 녹 성분이 늘어나면서 생기기 때문에, 색과 속도가 함께 움직이는 물리적 근거도 있습니다. 이 결과는 SEM, XRD, 전기화학 등 여섯 가지 분석으로 교차 검증했습니다.</w:t>
+              <w:t xml:space="preserve">이 시장은 규제가 반복 수요를 만듭니다. 미국 해양 플랫폼은 매년, 3~5년, 6~10년 주기로 점검이 의무입니다. 인터뷰에서 확인한 구매 동기는 안전, 비용, 규제와 보험 대응 세 가지였습니다. MLC는 그중 비용에서 바로 효과를 냅니다. 위험한 지점부터 배를 보내 선박 용선과 기상 대기 일수를 줄이고, 필요한 구간에만 리프트와 비계를 빌리고, 로프 액세스 팀을 보낼지 미리 판단하고, 점검 기록도 사진 리포트로 정리합니다.</w:t>
             </w:r>
           </w:p>
         </w:tc>
@@ -681,7 +681,7 @@
                 <w:sz w:val="20"/>
                 <w:szCs w:val="20"/>
               </w:rPr>
-              <w:t xml:space="preserve">규제 기반 반복 수요</w:t>
+              <w:t xml:space="preserve">시장 규모</w:t>
             </w:r>
           </w:p>
           <w:p>
@@ -719,7 +719,7 @@
                 <w:sz w:val="22"/>
                 <w:szCs w:val="22"/>
               </w:rPr>
-              <w:t xml:space="preserve">이 시장은 규제가 반복 수요를 만듭니다. 미국 해양 플랫폼은 매년, 3~5년, 6~10년 주기로 점검이 의무입니다. 인터뷰에서 확인한 구매 동기는 안전, 비용, 규제와 보험 대응 세 가지였습니다. MLC는 그중 비용에서 바로 효과를 냅니다. 위험한 지점부터 배를 보내 선박 용선과 기상 대기 일수를 줄이고, 필요한 구간에만 리프트와 비계를 빌리고, 로프 액세스 팀을 보낼지 미리 판단하고, 점검 기록도 사진 리포트로 정리합니다.</w:t>
+              <w:t xml:space="preserve">시장 규모입니다. 전체 시장은 글로벌 해양 점검·보수·유지 시장으로 2024년 136억 달러, 연 8.4%씩 성장하고 있습니다. 그중 저희가 바로 들어갈 수 있는 해양 드론 점검 서비스 시장은 15억 달러로, 연 11.5%씩 더 빠르게 커지고 있습니다. 저희는 3년 안에 이 시장의 1%, 1,500만 달러를 목표로 하고, 첫 타깃은 매년 점검을 받아야 하는 멕시코만 유인 생산 플랫폼 371곳입니다.</w:t>
             </w:r>
           </w:p>
         </w:tc>
@@ -764,7 +764,7 @@
                 <w:sz w:val="20"/>
                 <w:szCs w:val="20"/>
               </w:rPr>
-              <w:t xml:space="preserve">고객 생태계와 비즈니스 모델</w:t>
+              <w:t xml:space="preserve">비즈니스 모델</w:t>
             </w:r>
           </w:p>
           <w:p>
@@ -778,7 +778,7 @@
                 <w:sz w:val="18"/>
                 <w:szCs w:val="18"/>
               </w:rPr>
-              <w:t xml:space="preserve">약 25초</w:t>
+              <w:t xml:space="preserve">약 30초</w:t>
             </w:r>
           </w:p>
         </w:tc>
@@ -802,7 +802,7 @@
                 <w:sz w:val="22"/>
                 <w:szCs w:val="22"/>
               </w:rPr>
-              <w:t xml:space="preserve">비즈니스 모델입니다. 드론 운용사와 방식 전문 업체가 현장 촬영 데이터를 가져오고 고객을 소개하면, MLC가 위험도를 분석해 해양 석유·가스 운영사에 점검 우선순위 리포트를 드립니다. 요금은 점검 건당 또는 구독형입니다. 고객사 안에서는 현장 검사원이 쓰고, 부식 엔지니어링 매니저가 추천하고, 대표가 결정합니다.</w:t>
+              <w:t xml:space="preserve">비즈니스 모델입니다. 드론 운용사와 방식 전문 업체가 촬영 데이터를 가져오고 고객을 소개하면, MLC가 위험도를 분석해 고객사에 점검 우선순위 리포트를 드립니다. 매출은 점검 건당 요금과 연 구독으로 시작하고, 장기적으로는 드론과 점검 업체에 분석 엔진을 라이선스하겠습니다. 비용은 드론 촬영 운용과 모델 개발이고, 고객은 선박 용선과 리프트, 로프 액세스 비용을 아낄 수 있습니다.</w:t>
             </w:r>
           </w:p>
         </w:tc>

</xml_diff>

<commit_message>
v3 deck: domestic market framing
Slide 7 now shows Korea's statutory inspection cycles under the
Facility Safety Act instead of the U.S. Level I-III scheme. Slide 8 is
the nested-circle option: domestic facility inspection/diagnosis
market (KRW 519.2B, MOLIT), drone survey/inspection market
(KRW 166.7B, Drone Portal), and a 1% SOM target. Notes and the Word
script follow.

Co-Authored-By: Claude Opus 5.5 <noreply@anthropic.com>
Claude-Session: https://claude.ai/code/session_01WJhUeJknrpz3z9hRfyX3tP
</commit_message>
<xml_diff>
--- a/MLC_IR_A-STREAM2026_v3_script.docx
+++ b/MLC_IR_A-STREAM2026_v3_script.docx
@@ -41,7 +41,7 @@
           <w:sz w:val="20"/>
           <w:szCs w:val="20"/>
         </w:rPr>
-        <w:t xml:space="preserve">2026. 10. 21 · 발표 시간 5분 · 슬라이드 11장 · 대본 합계 약 4분 50초</w:t>
+        <w:t xml:space="preserve">2026. 10. 21 · 발표 시간 5분 · 슬라이드 11장 · 대본 합계 약 4분 45초</w:t>
       </w:r>
     </w:p>
     <w:tbl>
@@ -636,7 +636,7 @@
                 <w:sz w:val="22"/>
                 <w:szCs w:val="22"/>
               </w:rPr>
-              <w:t xml:space="preserve">이 시장은 규제가 반복 수요를 만듭니다. 미국 해양 플랫폼은 매년, 3~5년, 6~10년 주기로 점검이 의무입니다. 인터뷰에서 확인한 구매 동기는 안전, 비용, 규제와 보험 대응 세 가지였습니다. MLC는 그중 비용에서 바로 효과를 냅니다. 위험한 지점부터 배를 보내 선박 용선과 기상 대기 일수를 줄이고, 필요한 구간에만 리프트와 비계를 빌리고, 로프 액세스 팀을 보낼지 미리 판단하고, 점검 기록도 사진 리포트로 정리합니다.</w:t>
+              <w:t xml:space="preserve">이 시장은 법이 반복 수요를 만듭니다. 국내 「시설물안전법」에 따라 관리 대상 시설물 16만여 곳은 반기마다 정기안전점검, 1~3년마다 정밀안전점검을 받고, 제1종 시설물은 4~6년마다 정밀안전진단까지 받아야 합니다. 미국 현장 인터뷰에서 확인한 구매 동기는 안전, 비용, 규제 대응이었고, MLC는 그중 비용에서 바로 효과를 냅니다. 위험한 지점부터 배를 보내고, 필요한 구간에만 리프트와 비계를 빌리고, 로프 액세스 출동 여부를 미리 판단하고, 점검 기록도 사진 리포트로 정리합니다.</w:t>
             </w:r>
           </w:p>
         </w:tc>
@@ -681,7 +681,7 @@
                 <w:sz w:val="20"/>
                 <w:szCs w:val="20"/>
               </w:rPr>
-              <w:t xml:space="preserve">시장 규모</w:t>
+              <w:t xml:space="preserve">시장 규모 (국내)</w:t>
             </w:r>
           </w:p>
           <w:p>
@@ -695,7 +695,7 @@
                 <w:sz w:val="18"/>
                 <w:szCs w:val="18"/>
               </w:rPr>
-              <w:t xml:space="preserve">약 30초</w:t>
+              <w:t xml:space="preserve">약 25초</w:t>
             </w:r>
           </w:p>
         </w:tc>
@@ -719,7 +719,7 @@
                 <w:sz w:val="22"/>
                 <w:szCs w:val="22"/>
               </w:rPr>
-              <w:t xml:space="preserve">시장 규모입니다. 전체 시장은 글로벌 해양 점검·보수·유지 시장으로 2024년 136억 달러, 연 8.4%씩 성장하고 있습니다. 그중 저희가 바로 들어갈 수 있는 해양 드론 점검 서비스 시장은 15억 달러로, 연 11.5%씩 더 빠르게 커지고 있습니다. 저희는 3년 안에 이 시장의 1%, 1,500만 달러를 목표로 하고, 첫 타깃은 매년 점검을 받아야 하는 멕시코만 유인 생산 플랫폼 371곳입니다.</w:t>
+              <w:t xml:space="preserve">시장 규모입니다. 국내 시설물 안전점검·진단 시장은 2021년 5,192억 원으로, 연 15%씩 성장해 왔습니다. 그중 드론 측량·점검·관측 시장이 1,667억 원이고, 저희는 3년 안에 이 시장의 1%, 17억 원을 목표로 합니다. 해양·항만 강구조물과 해상풍력부터 시작하겠습니다.</w:t>
             </w:r>
           </w:p>
         </w:tc>

</xml_diff>